<commit_message>
chore: update LibreOffice lock file timestamp for estimate template
</commit_message>
<xml_diff>
--- a/estimate_perday_template.docx
+++ b/estimate_perday_template.docx
@@ -191,14 +191,14 @@
         <w:tblLook w:val="04a0" w:noVBand="1" w:noHBand="0" w:lastColumn="0" w:firstColumn="1" w:lastRow="0" w:firstRow="1"/>
       </w:tblPr>
       <w:tblGrid>
-        <w:gridCol w:w="3295"/>
-        <w:gridCol w:w="7234"/>
+        <w:gridCol w:w="3294"/>
+        <w:gridCol w:w="7235"/>
       </w:tblGrid>
       <w:tr>
         <w:trPr/>
         <w:tc>
           <w:tcPr>
-            <w:tcW w:w="3295" w:type="dxa"/>
+            <w:tcW w:w="3294" w:type="dxa"/>
             <w:tcBorders>
               <w:top w:val="nil"/>
               <w:left w:val="nil"/>
@@ -722,7 +722,16 @@
               </w:rPr>
               <w:t>End: {{EVENT_END}}</w:t>
               <w:br/>
-              <w:t>{{EVENT_GUESTS}} Guests</w:t>
+            </w:r>
+            <w:r>
+              <w:rPr>
+                <w:rFonts w:eastAsia="Aptos" w:cs="Open Sans" w:ascii="Open Sans" w:hAnsi="Open Sans"/>
+                <w:kern w:val="2"/>
+                <w:sz w:val="18"/>
+                <w:szCs w:val="18"/>
+                <w:lang w:val="en-US" w:eastAsia="en-US" w:bidi="ar-SA"/>
+              </w:rPr>
+              <w:t>{{DAILY_GUESTS}}</w:t>
             </w:r>
           </w:p>
           <w:p>
@@ -778,7 +787,7 @@
         </w:tc>
         <w:tc>
           <w:tcPr>
-            <w:tcW w:w="7234" w:type="dxa"/>
+            <w:tcW w:w="7235" w:type="dxa"/>
             <w:tcBorders>
               <w:top w:val="nil"/>
               <w:left w:val="nil"/>
@@ -1646,7 +1655,16 @@
               </w:rPr>
               <w:t>End: {{EVENT_END}}</w:t>
               <w:br/>
-              <w:t>{{EVENT_GUESTS}} Guests</w:t>
+            </w:r>
+            <w:r>
+              <w:rPr>
+                <w:rFonts w:eastAsia="Aptos" w:cs="Open Sans" w:ascii="Open Sans" w:hAnsi="Open Sans"/>
+                <w:kern w:val="2"/>
+                <w:sz w:val="18"/>
+                <w:szCs w:val="18"/>
+                <w:lang w:val="en-US" w:eastAsia="en-US" w:bidi="ar-SA"/>
+              </w:rPr>
+              <w:t>{{DAILY_GUESTS}}</w:t>
             </w:r>
           </w:p>
           <w:p>
@@ -3884,7 +3902,7 @@
                     <wp:posOffset>2089785</wp:posOffset>
                   </wp:positionH>
                   <wp:positionV relativeFrom="paragraph">
-                    <wp:posOffset>5715</wp:posOffset>
+                    <wp:posOffset>5080</wp:posOffset>
                   </wp:positionV>
                   <wp:extent cx="3858260" cy="1271905"/>
                   <wp:effectExtent l="0" t="0" r="0" b="5080"/>
@@ -3942,7 +3960,7 @@
                   <v:path o:extrusionok="f" gradientshapeok="t" o:connecttype="rect"/>
                   <o:lock v:ext="edit" aspectratio="t"/>
                 </v:shapetype>
-                <v:shape id="shape_0" ID="Imagen 3" stroked="f" o:allowincell="f" style="position:absolute;margin-left:164.55pt;margin-top:0.45pt;width:303.75pt;height:100.1pt;mso-wrap-style:none;v-text-anchor:middle;rotation:180" wp14:anchorId="66026393" type="_x0000_t75">
+                <v:shape id="shape_0" ID="Imagen 3" stroked="f" o:allowincell="f" style="position:absolute;margin-left:164.55pt;margin-top:0.4pt;width:303.75pt;height:100.1pt;mso-wrap-style:none;v-text-anchor:middle;rotation:180" wp14:anchorId="66026393" type="_x0000_t75">
                   <v:imagedata r:id="rId2" o:detectmouseclick="t"/>
                   <v:stroke color="#3465a4" joinstyle="round" endcap="flat"/>
                   <w10:wrap type="none"/>
@@ -4144,23 +4162,12 @@
         </w:pPr>
         <w:r>
           <w:rPr>
-            <w:b/>
-            <w:bCs/>
             <w:color w:val="auto"/>
             <w:sz w:val="12"/>
             <w:szCs w:val="12"/>
             <w:lang w:val="en-US"/>
           </w:rPr>
-          <w:t>Guests</w:t>
-        </w:r>
-        <w:r>
-          <w:rPr>
-            <w:color w:val="auto"/>
-            <w:sz w:val="12"/>
-            <w:szCs w:val="12"/>
-            <w:lang w:val="en-US"/>
-          </w:rPr>
-          <w:t>: {{EVENT_GUESTS}}</w:t>
+          <w:t>{{DAILY_GUESTS}}</w:t>
         </w:r>
       </w:p>
     </w:sdtContent>

</xml_diff>

<commit_message>
chore: remove LibreOffice lock file and update template documents
</commit_message>
<xml_diff>
--- a/estimate_perday_template.docx
+++ b/estimate_perday_template.docx
@@ -2463,7 +2463,27 @@
                 <w:szCs w:val="18"/>
                 <w:lang w:val="en-US" w:eastAsia="en-US" w:bidi="ar-SA"/>
               </w:rPr>
-              <w:t>The undersigned, as a duly authorized representative of the Client, Math for America, hereby contract the services of Foodesign Conceptual Events as listed and quoted in this proposal on behalf of the Client according to the terms and conditions herein.</w:t>
+              <w:t>The undersigned, as a duly authorized representative of the Client, {{</w:t>
+            </w:r>
+            <w:r>
+              <w:rPr>
+                <w:rFonts w:eastAsia="Aptos" w:cs="Open Sans" w:ascii="Open Sans" w:hAnsi="Open Sans"/>
+                <w:kern w:val="2"/>
+                <w:sz w:val="18"/>
+                <w:szCs w:val="18"/>
+                <w:lang w:val="en-US" w:eastAsia="en-US" w:bidi="ar-SA"/>
+              </w:rPr>
+              <w:t>CLIENT_NAME</w:t>
+            </w:r>
+            <w:r>
+              <w:rPr>
+                <w:rFonts w:eastAsia="Aptos" w:cs="Open Sans" w:ascii="Open Sans" w:hAnsi="Open Sans"/>
+                <w:kern w:val="2"/>
+                <w:sz w:val="18"/>
+                <w:szCs w:val="18"/>
+                <w:lang w:val="en-US" w:eastAsia="en-US" w:bidi="ar-SA"/>
+              </w:rPr>
+              <w:t>}}, hereby contract the services of Foodesign Conceptual Events as listed and quoted in this proposal on behalf of the Client according to the terms and conditions herein.</w:t>
             </w:r>
           </w:p>
           <w:p>

</xml_diff>

<commit_message>
refactor: rename financial labels in DOCX generators for improved clarity and transparency
</commit_message>
<xml_diff>
--- a/estimate_perday_template.docx
+++ b/estimate_perday_template.docx
@@ -722,15 +722,6 @@
               </w:rPr>
               <w:t>End: {{EVENT_END}}</w:t>
               <w:br/>
-            </w:r>
-            <w:r>
-              <w:rPr>
-                <w:rFonts w:eastAsia="Aptos" w:cs="Open Sans" w:ascii="Open Sans" w:hAnsi="Open Sans"/>
-                <w:kern w:val="2"/>
-                <w:sz w:val="18"/>
-                <w:szCs w:val="18"/>
-                <w:lang w:val="en-US" w:eastAsia="en-US" w:bidi="ar-SA"/>
-              </w:rPr>
               <w:t>{{DAILY_GUESTS}}</w:t>
             </w:r>
           </w:p>
@@ -882,7 +873,51 @@
                 <w:szCs w:val="20"/>
                 <w:lang w:val="en-US" w:eastAsia="en-US" w:bidi="ar-SA"/>
               </w:rPr>
-              <w:t>Dear The Simons Foundation, thank you for the opportunity to provide our services for your events. We look forward to sharing our services with you and your guests. Booking staff, planning and directing an event can be stressful. Therefore, we promise to do everything we can to ease the burden on you.</w:t>
+              <w:t xml:space="preserve">Dear </w:t>
+            </w:r>
+            <w:r>
+              <w:rPr>
+                <w:rFonts w:eastAsia="Aptos" w:cs="Open Sans" w:ascii="Open Sans" w:hAnsi="Open Sans"/>
+                <w:color w:val="323232"/>
+                <w:kern w:val="2"/>
+                <w:sz w:val="20"/>
+                <w:szCs w:val="20"/>
+                <w:lang w:val="en-US" w:eastAsia="en-US" w:bidi="ar-SA"/>
+              </w:rPr>
+              <w:t>{</w:t>
+            </w:r>
+            <w:r>
+              <w:rPr>
+                <w:rFonts w:eastAsia="Aptos" w:cs="Open Sans" w:ascii="Open Sans" w:hAnsi="Open Sans"/>
+                <w:color w:val="323232"/>
+                <w:kern w:val="2"/>
+                <w:sz w:val="20"/>
+                <w:szCs w:val="20"/>
+                <w:lang w:val="en-US" w:eastAsia="en-US" w:bidi="ar-SA"/>
+              </w:rPr>
+              <w:t>CLIENT_NAME</w:t>
+            </w:r>
+            <w:r>
+              <w:rPr>
+                <w:rFonts w:eastAsia="Aptos" w:cs="Open Sans" w:ascii="Open Sans" w:hAnsi="Open Sans"/>
+                <w:color w:val="323232"/>
+                <w:kern w:val="2"/>
+                <w:sz w:val="20"/>
+                <w:szCs w:val="20"/>
+                <w:lang w:val="en-US" w:eastAsia="en-US" w:bidi="ar-SA"/>
+              </w:rPr>
+              <w:t>}}</w:t>
+            </w:r>
+            <w:r>
+              <w:rPr>
+                <w:rFonts w:eastAsia="Aptos" w:cs="Open Sans" w:ascii="Open Sans" w:hAnsi="Open Sans"/>
+                <w:color w:val="323232"/>
+                <w:kern w:val="2"/>
+                <w:sz w:val="20"/>
+                <w:szCs w:val="20"/>
+                <w:lang w:val="en-US" w:eastAsia="en-US" w:bidi="ar-SA"/>
+              </w:rPr>
+              <w:t>, thank you for the opportunity to provide our services for your events. We look forward to sharing our services with you and your guests. Booking staff, planning and directing an event can be stressful. Therefore, we promise to do everything we can to ease the burden on you.</w:t>
             </w:r>
           </w:p>
           <w:p>
@@ -1655,15 +1690,6 @@
               </w:rPr>
               <w:t>End: {{EVENT_END}}</w:t>
               <w:br/>
-            </w:r>
-            <w:r>
-              <w:rPr>
-                <w:rFonts w:eastAsia="Aptos" w:cs="Open Sans" w:ascii="Open Sans" w:hAnsi="Open Sans"/>
-                <w:kern w:val="2"/>
-                <w:sz w:val="18"/>
-                <w:szCs w:val="18"/>
-                <w:lang w:val="en-US" w:eastAsia="en-US" w:bidi="ar-SA"/>
-              </w:rPr>
               <w:t>{{DAILY_GUESTS}}</w:t>
             </w:r>
           </w:p>
@@ -2463,27 +2489,7 @@
                 <w:szCs w:val="18"/>
                 <w:lang w:val="en-US" w:eastAsia="en-US" w:bidi="ar-SA"/>
               </w:rPr>
-              <w:t>The undersigned, as a duly authorized representative of the Client, {{</w:t>
-            </w:r>
-            <w:r>
-              <w:rPr>
-                <w:rFonts w:eastAsia="Aptos" w:cs="Open Sans" w:ascii="Open Sans" w:hAnsi="Open Sans"/>
-                <w:kern w:val="2"/>
-                <w:sz w:val="18"/>
-                <w:szCs w:val="18"/>
-                <w:lang w:val="en-US" w:eastAsia="en-US" w:bidi="ar-SA"/>
-              </w:rPr>
-              <w:t>CLIENT_NAME</w:t>
-            </w:r>
-            <w:r>
-              <w:rPr>
-                <w:rFonts w:eastAsia="Aptos" w:cs="Open Sans" w:ascii="Open Sans" w:hAnsi="Open Sans"/>
-                <w:kern w:val="2"/>
-                <w:sz w:val="18"/>
-                <w:szCs w:val="18"/>
-                <w:lang w:val="en-US" w:eastAsia="en-US" w:bidi="ar-SA"/>
-              </w:rPr>
-              <w:t>}}, hereby contract the services of Foodesign Conceptual Events as listed and quoted in this proposal on behalf of the Client according to the terms and conditions herein.</w:t>
+              <w:t>The undersigned, as a duly authorized representative of the Client, {{CLIENT_NAME}}, hereby contract the services of Foodesign Conceptual Events as listed and quoted in this proposal on behalf of the Client according to the terms and conditions herein.</w:t>
             </w:r>
           </w:p>
           <w:p>
@@ -3922,7 +3928,7 @@
                     <wp:posOffset>2089785</wp:posOffset>
                   </wp:positionH>
                   <wp:positionV relativeFrom="paragraph">
-                    <wp:posOffset>5080</wp:posOffset>
+                    <wp:posOffset>4445</wp:posOffset>
                   </wp:positionV>
                   <wp:extent cx="3858260" cy="1271905"/>
                   <wp:effectExtent l="0" t="0" r="0" b="5080"/>
@@ -3980,7 +3986,7 @@
                   <v:path o:extrusionok="f" gradientshapeok="t" o:connecttype="rect"/>
                   <o:lock v:ext="edit" aspectratio="t"/>
                 </v:shapetype>
-                <v:shape id="shape_0" ID="Imagen 3" stroked="f" o:allowincell="f" style="position:absolute;margin-left:164.55pt;margin-top:0.4pt;width:303.75pt;height:100.1pt;mso-wrap-style:none;v-text-anchor:middle;rotation:180" wp14:anchorId="66026393" type="_x0000_t75">
+                <v:shape id="shape_0" ID="Imagen 3" stroked="f" o:allowincell="f" style="position:absolute;margin-left:164.55pt;margin-top:0.35pt;width:303.75pt;height:100.1pt;mso-wrap-style:none;v-text-anchor:middle;rotation:180" wp14:anchorId="66026393" type="_x0000_t75">
                   <v:imagedata r:id="rId2" o:detectmouseclick="t"/>
                   <v:stroke color="#3465a4" joinstyle="round" endcap="flat"/>
                   <w10:wrap type="none"/>

</xml_diff>